<commit_message>
Prep for second run of Proposal
</commit_message>
<xml_diff>
--- a/BHB - Capstone Proposal.docx
+++ b/BHB - Capstone Proposal.docx
@@ -14,7 +14,6 @@
           <w:docPartUnique/>
         </w:docPartObj>
       </w:sdtPr>
-      <w:sdtEndPr/>
       <w:sdtContent>
         <w:p>
           <w:pPr>
@@ -3778,13 +3777,8 @@
                                   </w:rPr>
                                 </w:pPr>
                                 <w:r>
-                                  <w:t xml:space="preserve">Whitireia and </w:t>
+                                  <w:t>Whitireia and WelTec</w:t>
                                 </w:r>
-                                <w:proofErr w:type="spellStart"/>
-                                <w:r>
-                                  <w:t>WelTec</w:t>
-                                </w:r>
-                                <w:proofErr w:type="spellEnd"/>
                               </w:p>
                             </w:txbxContent>
                           </wps:txbx>
@@ -6634,7 +6628,15 @@
         <w:pStyle w:val="TNR"/>
       </w:pPr>
       <w:r>
-        <w:t xml:space="preserve">The key problem they would like solved is the comparison of traditional forensic tools to AI versions of forensic tools so that we may develop an analysis of whether or not AI is a worthwhile venture for forensics or if it uses an unreasonable amount of resources. </w:t>
+        <w:t xml:space="preserve">The key problem they would like solved is the comparison of traditional forensic tools to AI versions of forensic tools so that we may develop an analysis of whether or not AI is a worthwhile venture for forensics or if it uses an unreasonable </w:t>
+      </w:r>
+      <w:proofErr w:type="gramStart"/>
+      <w:r>
+        <w:t>amount</w:t>
+      </w:r>
+      <w:proofErr w:type="gramEnd"/>
+      <w:r>
+        <w:t xml:space="preserve"> of resources. </w:t>
       </w:r>
     </w:p>
     <w:p>
@@ -6653,6 +6655,10 @@
       </w:pPr>
       <w:r>
         <w:t xml:space="preserve">The main deliverable for this project will be a research report that discusses our working output and analysis for every file that we have tested our tools and locally hosted AI on and the resulting output of our findings. The deliverables will also include either a live demonstration or a video demonstration depending on the viability of what is included within it. </w:t>
+      </w:r>
+      <w:r>
+        <w:br/>
+        <w:t>JUST A VIDEO, NOT A LIVE DEMO</w:t>
       </w:r>
     </w:p>
     <w:p>
@@ -6757,7 +6763,15 @@
         <w:pStyle w:val="TNR"/>
       </w:pPr>
       <w:r>
-        <w:t xml:space="preserve">Tools that can be run in the Kali Linux environment for the intended uses of performing digital forensics against publicly available datasets are within the scope of this project. Forensic testing and analysis will be performed on OS and mobile-based datasets. As forensics expands a wide variety of activities such as data-carving, memory forensics and network forensics, these will all be considered in-scope for this project as we are looking to test these tools against a variety of different datasets to display their strengths and weaknesses.  The testing of legacy forensics tools and tools that are aided by artificial intelligence are in scope as we are looking to compare the two types of tool. The analysis and documentation of said testing is also within scope. </w:t>
+        <w:t xml:space="preserve">Tools that can be run in the Kali Linux environment for the intended uses of performing digital forensics against publicly available datasets are within the scope of this project. Forensic testing and analysis will be performed on OS and mobile-based datasets. As forensics expands a wide variety of activities such as data-carving, memory forensics and network forensics, these will all be considered in-scope for this project as we are looking to test these tools against a variety of different datasets to display their strengths and weaknesses.  The testing of legacy forensics tools and tools that are aided by artificial intelligence are in scope as we are looking to compare the two types of </w:t>
+      </w:r>
+      <w:proofErr w:type="gramStart"/>
+      <w:r>
+        <w:t>tool</w:t>
+      </w:r>
+      <w:proofErr w:type="gramEnd"/>
+      <w:r>
+        <w:t xml:space="preserve">. The analysis and documentation of said testing is also within scope. </w:t>
       </w:r>
     </w:p>
     <w:p>
@@ -6786,7 +6800,15 @@
         <w:t>a full investigation into them is</w:t>
       </w:r>
       <w:r>
-        <w:t xml:space="preserve"> considered to be outside the scope of this project. Cloud-based tools are also out of scope, this is because the machine we will be working on is a locally hosted machine on a local network.</w:t>
+        <w:t xml:space="preserve"> considered to be outside the scope of this project. Cloud-based tools are also out of </w:t>
+      </w:r>
+      <w:proofErr w:type="gramStart"/>
+      <w:r>
+        <w:t>scope,</w:t>
+      </w:r>
+      <w:proofErr w:type="gramEnd"/>
+      <w:r>
+        <w:t xml:space="preserve"> this is because the machine we will be working on is a locally hosted machine on a local network.</w:t>
       </w:r>
     </w:p>
     <w:p>
@@ -6796,11 +6818,17 @@
       <w:r>
         <w:t>We are not interested in our model’s abilities to generate reports, or come to conclusions based on our evidence, our investigation into the efficacy of these tools is in their empirical capacity. Essentially their usefulness to an examiner as opposed to an investigator.</w:t>
       </w:r>
-    </w:p>
-    <w:p>
-      <w:pPr>
-        <w:pStyle w:val="TNR"/>
-      </w:pPr>
+      <w:r>
+        <w:t xml:space="preserve"> EXPLAIN WHAT THESE ROLES ARE/DO. NOT EVERYBODY IS DF BACKGROUND.</w:t>
+      </w:r>
+    </w:p>
+    <w:p>
+      <w:pPr>
+        <w:pStyle w:val="Heading2"/>
+      </w:pPr>
+      <w:r>
+        <w:t>Use of AI</w:t>
+      </w:r>
     </w:p>
     <w:p>
       <w:pPr>
@@ -6808,19 +6836,16 @@
           <w:lang w:val="en-NZ"/>
         </w:rPr>
       </w:pPr>
-    </w:p>
-    <w:p>
-      <w:pPr>
+      <w:r>
         <w:rPr>
           <w:lang w:val="en-NZ"/>
         </w:rPr>
-      </w:pPr>
-    </w:p>
-    <w:p>
-      <w:pPr>
-        <w:rPr>
-          <w:lang w:val="en-NZ"/>
-        </w:rPr>
+        <w:t>Half a page discussing how AI is relevant to this project. Needs citations.</w:t>
+      </w:r>
+    </w:p>
+    <w:p>
+      <w:pPr>
+        <w:pStyle w:val="TNR"/>
       </w:pPr>
     </w:p>
     <w:p>
@@ -6991,7 +7016,6 @@
           <w:id w:val="1397781156"/>
           <w:citation/>
         </w:sdtPr>
-        <w:sdtEndPr/>
         <w:sdtContent>
           <w:r>
             <w:fldChar w:fldCharType="begin"/>
@@ -7020,6 +7044,18 @@
       <w:r>
         <w:t>. Kanban is a visual workflow management method that will allow us to better visualize the workload and optimise it according to demand. Kanban works best for us because it is familiar to us as we have used it in previous classes and can be integrated seamlessly into our project.</w:t>
       </w:r>
+      <w:r>
+        <w:br/>
+        <w:t>EXPAND. IS IT AGILE? HOW TO MEASURE MILESTONES. HOW TO TELL IF ON TRACK.</w:t>
+      </w:r>
+    </w:p>
+    <w:p>
+      <w:pPr>
+        <w:pStyle w:val="TNR"/>
+      </w:pPr>
+      <w:r>
+        <w:t>SAY SOME BS ABOUT SCRUM AND WHY WE AINT USING IT.</w:t>
+      </w:r>
     </w:p>
     <w:p>
       <w:pPr>
@@ -7064,7 +7100,6 @@
           <w:id w:val="-1745091917"/>
           <w:citation/>
         </w:sdtPr>
-        <w:sdtEndPr/>
         <w:sdtContent>
           <w:r>
             <w:fldChar w:fldCharType="begin"/>
@@ -7131,13 +7166,45 @@
         <w:t>:</w:t>
       </w:r>
       <w:r>
-        <w:t xml:space="preserve"> Acquire tool to be tested, Review tool documentation, Select relevant test cases depending on features supported by tool, Develop </w:t>
+        <w:t xml:space="preserve"> Acquire tool to be tested, Review tool documentation, </w:t>
+      </w:r>
+      <w:proofErr w:type="gramStart"/>
+      <w:r>
+        <w:t>Select</w:t>
+      </w:r>
+      <w:proofErr w:type="gramEnd"/>
+      <w:r>
+        <w:t xml:space="preserve"> relevant test cases depending on features supported by tool, </w:t>
+      </w:r>
+      <w:proofErr w:type="gramStart"/>
+      <w:r>
+        <w:t>Develop</w:t>
+      </w:r>
+      <w:proofErr w:type="gramEnd"/>
+      <w:r>
+        <w:t xml:space="preserve"> </w:t>
       </w:r>
       <w:r>
         <w:t>t</w:t>
       </w:r>
       <w:r>
-        <w:t xml:space="preserve">est strategy, Execute tests, Produce test report, </w:t>
+        <w:t xml:space="preserve">est strategy, </w:t>
+      </w:r>
+      <w:proofErr w:type="gramStart"/>
+      <w:r>
+        <w:t>Execute</w:t>
+      </w:r>
+      <w:proofErr w:type="gramEnd"/>
+      <w:r>
+        <w:t xml:space="preserve"> tests, </w:t>
+      </w:r>
+      <w:proofErr w:type="gramStart"/>
+      <w:r>
+        <w:t>Produce</w:t>
+      </w:r>
+      <w:proofErr w:type="gramEnd"/>
+      <w:r>
+        <w:t xml:space="preserve"> test report, </w:t>
       </w:r>
       <w:r>
         <w:t>Team r</w:t>
@@ -7235,6 +7302,17 @@
       <w:r>
         <w:t>Our group will be using GitHub repository in order to collate our work, and which provides us with a clear history of changes and can provide a timeline for when work was completed in order to be presented once the project has been completed.</w:t>
       </w:r>
+      <w:r>
+        <w:t xml:space="preserve"> </w:t>
+      </w:r>
+      <w:hyperlink r:id="rId10" w:history="1">
+        <w:r>
+          <w:rPr>
+            <w:rStyle w:val="Hyperlink"/>
+          </w:rPr>
+          <w:t>https://github.com/DavidSushames/BHB-Capstone</w:t>
+        </w:r>
+      </w:hyperlink>
     </w:p>
     <w:p>
       <w:pPr>
@@ -7252,6 +7330,47 @@
       <w:r>
         <w:t>.</w:t>
       </w:r>
+    </w:p>
+    <w:p>
+      <w:pPr>
+        <w:pStyle w:val="TNR"/>
+      </w:pPr>
+      <w:r>
+        <w:t>CITATION FOR LM STUDIO</w:t>
+      </w:r>
+    </w:p>
+    <w:p>
+      <w:pPr>
+        <w:pStyle w:val="TNR"/>
+      </w:pPr>
+      <w:r>
+        <w:lastRenderedPageBreak/>
+        <w:t>KALI VERSION NUMBER</w:t>
+      </w:r>
+    </w:p>
+    <w:p>
+      <w:pPr>
+        <w:pStyle w:val="TNR"/>
+      </w:pPr>
+      <w:r>
+        <w:t>DISCUSS FORENSIC TOOLS</w:t>
+      </w:r>
+      <w:r>
+        <w:t xml:space="preserve"> WE </w:t>
+      </w:r>
+      <w:proofErr w:type="gramStart"/>
+      <w:r>
+        <w:t>ASSESSING</w:t>
+      </w:r>
+      <w:proofErr w:type="gramEnd"/>
+      <w:r>
+        <w:t xml:space="preserve"> (Version number + Citations)</w:t>
+      </w:r>
+    </w:p>
+    <w:p>
+      <w:pPr>
+        <w:pStyle w:val="TNR"/>
+      </w:pPr>
     </w:p>
     <w:p>
       <w:pPr>
@@ -7362,6 +7481,12 @@
       </w:r>
       <w:bookmarkEnd w:id="16"/>
       <w:bookmarkEnd w:id="17"/>
+    </w:p>
+    <w:p>
+      <w:pPr>
+        <w:pStyle w:val="Caption"/>
+        <w:keepNext/>
+      </w:pPr>
     </w:p>
     <w:tbl>
       <w:tblPr>
@@ -7548,6 +7673,7 @@
               <w:pStyle w:val="TNR"/>
             </w:pPr>
             <w:r>
+              <w:lastRenderedPageBreak/>
               <w:t>Dave Sushames</w:t>
             </w:r>
           </w:p>
@@ -7572,6 +7698,7 @@
           <w:p>
             <w:pPr>
               <w:pStyle w:val="TNR"/>
+              <w:keepNext/>
             </w:pPr>
             <w:r>
               <w:t>Organises meetings with the client/advisor, consolidates individual log hours into the group hours log, manages the git repository, contributes to collaborative documents and conducts research. Ensures we are following the chosen methodology.</w:t>
@@ -7582,10 +7709,35 @@
     </w:tbl>
     <w:p>
       <w:pPr>
+        <w:pStyle w:val="Caption"/>
         <w:rPr>
           <w:lang w:val="en-NZ"/>
         </w:rPr>
       </w:pPr>
+      <w:r>
+        <w:t xml:space="preserve">Table </w:t>
+      </w:r>
+      <w:r>
+        <w:fldChar w:fldCharType="begin"/>
+      </w:r>
+      <w:r>
+        <w:instrText xml:space="preserve"> SEQ Table \* ARABIC </w:instrText>
+      </w:r>
+      <w:r>
+        <w:fldChar w:fldCharType="separate"/>
+      </w:r>
+      <w:r>
+        <w:rPr>
+          <w:noProof/>
+        </w:rPr>
+        <w:t>1</w:t>
+      </w:r>
+      <w:r>
+        <w:fldChar w:fldCharType="end"/>
+      </w:r>
+      <w:r>
+        <w:t xml:space="preserve"> - Group members</w:t>
+      </w:r>
     </w:p>
     <w:p>
       <w:pPr>
@@ -7681,7 +7833,6 @@
               <w:pStyle w:val="TNR"/>
             </w:pPr>
             <w:r>
-              <w:lastRenderedPageBreak/>
               <w:t>Client: Geoff Gordon</w:t>
             </w:r>
           </w:p>
@@ -7823,7 +7974,15 @@
               <w:pStyle w:val="TNR"/>
             </w:pPr>
             <w:r>
-              <w:t>Olivia-hey.hey01</w:t>
+              <w:t>Olivia-</w:t>
+            </w:r>
+            <w:proofErr w:type="gramStart"/>
+            <w:r>
+              <w:t>hey.hey</w:t>
+            </w:r>
+            <w:proofErr w:type="gramEnd"/>
+            <w:r>
+              <w:t>01</w:t>
             </w:r>
           </w:p>
         </w:tc>
@@ -7944,7 +8103,7 @@
         <w:rPr>
           <w:noProof/>
         </w:rPr>
-        <w:t>1</w:t>
+        <w:t>2</w:t>
       </w:r>
       <w:r>
         <w:fldChar w:fldCharType="end"/>
@@ -8407,6 +8566,7 @@
                 <w:b/>
                 <w:bCs/>
               </w:rPr>
+              <w:lastRenderedPageBreak/>
               <w:t>Acquisition of forensic datasets/disk images for analysis</w:t>
             </w:r>
           </w:p>
@@ -8611,15 +8771,7 @@
                 <w:b/>
                 <w:bCs/>
               </w:rPr>
-              <w:t xml:space="preserve">Creation or adaption of a process (CFTT) and metrics with which to objectively assess the </w:t>
-            </w:r>
-            <w:r>
-              <w:rPr>
-                <w:b/>
-                <w:bCs/>
-              </w:rPr>
-              <w:lastRenderedPageBreak/>
-              <w:t>efficacy of two or more tools.</w:t>
+              <w:t>Creation or adaption of a process (CFTT) and metrics with which to objectively assess the efficacy of two or more tools.</w:t>
             </w:r>
           </w:p>
         </w:tc>
@@ -8632,7 +8784,6 @@
               <w:pStyle w:val="TNR"/>
             </w:pPr>
             <w:r>
-              <w:lastRenderedPageBreak/>
               <w:t>C</w:t>
             </w:r>
           </w:p>
@@ -9151,6 +9302,42 @@
           <w:p>
             <w:pPr>
               <w:pStyle w:val="TNR"/>
+              <w:rPr>
+                <w:rFonts w:cs="Arial"/>
+              </w:rPr>
+            </w:pPr>
+            <w:r>
+              <w:rPr>
+                <w:rFonts w:cs="Arial"/>
+              </w:rPr>
+              <w:t>Mid project proposal thing fuck</w:t>
+            </w:r>
+          </w:p>
+        </w:tc>
+        <w:tc>
+          <w:tcPr>
+            <w:tcW w:w="4701" w:type="dxa"/>
+            <w:shd w:val="clear" w:color="auto" w:fill="C1E4F5" w:themeFill="accent1" w:themeFillTint="33"/>
+          </w:tcPr>
+          <w:p>
+            <w:pPr>
+              <w:pStyle w:val="TNR"/>
+              <w:rPr>
+                <w:rFonts w:cs="Arial"/>
+              </w:rPr>
+            </w:pPr>
+          </w:p>
+        </w:tc>
+      </w:tr>
+      <w:tr>
+        <w:tc>
+          <w:tcPr>
+            <w:tcW w:w="4508" w:type="dxa"/>
+            <w:shd w:val="clear" w:color="auto" w:fill="C1E4F5" w:themeFill="accent1" w:themeFillTint="33"/>
+          </w:tcPr>
+          <w:p>
+            <w:pPr>
+              <w:pStyle w:val="TNR"/>
             </w:pPr>
             <w:r>
               <w:rPr>
@@ -9279,7 +9466,7 @@
         <w:rPr>
           <w:noProof/>
         </w:rPr>
-        <w:t>2</w:t>
+        <w:t>3</w:t>
       </w:r>
       <w:r>
         <w:fldChar w:fldCharType="end"/>
@@ -9658,7 +9845,11 @@
               <w:pStyle w:val="TNR"/>
             </w:pPr>
             <w:r>
-              <w:t>R15 Version control conflicts.</w:t>
+              <w:t xml:space="preserve">R15 Version </w:t>
+            </w:r>
+            <w:r>
+              <w:lastRenderedPageBreak/>
+              <w:t>control conflicts.</w:t>
             </w:r>
           </w:p>
         </w:tc>
@@ -9872,7 +10063,6 @@
               <w:pStyle w:val="TNR"/>
             </w:pPr>
             <w:r>
-              <w:lastRenderedPageBreak/>
               <w:t>R10 Advisor becomes unavailable.</w:t>
             </w:r>
           </w:p>
@@ -9895,7 +10085,6 @@
               <w:pStyle w:val="TNR"/>
             </w:pPr>
             <w:r>
-              <w:lastRenderedPageBreak/>
               <w:t xml:space="preserve">R07 Hardware stolen. </w:t>
             </w:r>
           </w:p>
@@ -9904,7 +10093,6 @@
               <w:pStyle w:val="TNR"/>
             </w:pPr>
             <w:r>
-              <w:lastRenderedPageBreak/>
               <w:t>R08 Data/File loss/corruption.</w:t>
             </w:r>
           </w:p>
@@ -9919,7 +10107,6 @@
               <w:pStyle w:val="TNR"/>
             </w:pPr>
             <w:r>
-              <w:lastRenderedPageBreak/>
               <w:t>R03 Academic integrity violation.</w:t>
             </w:r>
           </w:p>
@@ -10031,7 +10218,7 @@
         <w:rPr>
           <w:noProof/>
         </w:rPr>
-        <w:t>3</w:t>
+        <w:t>4</w:t>
       </w:r>
       <w:r>
         <w:fldChar w:fldCharType="end"/>
@@ -10257,6 +10444,7 @@
               <w:pStyle w:val="TNR"/>
             </w:pPr>
             <w:r>
+              <w:lastRenderedPageBreak/>
               <w:t>R06 Software difficulties</w:t>
             </w:r>
           </w:p>
@@ -10353,7 +10541,6 @@
               <w:pStyle w:val="TNR"/>
             </w:pPr>
             <w:r>
-              <w:lastRenderedPageBreak/>
               <w:t>R09 Client becomes unavailable</w:t>
             </w:r>
           </w:p>
@@ -10564,7 +10751,7 @@
         <w:rPr>
           <w:noProof/>
         </w:rPr>
-        <w:t>4</w:t>
+        <w:t>5</w:t>
       </w:r>
       <w:r>
         <w:fldChar w:fldCharType="end"/>
@@ -10667,6 +10854,7 @@
               <w:pStyle w:val="TNR"/>
             </w:pPr>
             <w:r>
+              <w:lastRenderedPageBreak/>
               <w:t>R02 Team member becomes unavailable</w:t>
             </w:r>
           </w:p>
@@ -10779,7 +10967,6 @@
               <w:pStyle w:val="TNR"/>
             </w:pPr>
             <w:r>
-              <w:lastRenderedPageBreak/>
               <w:t>R06 Software difficulties</w:t>
             </w:r>
           </w:p>
@@ -10959,6 +11146,9 @@
         </w:tc>
       </w:tr>
       <w:tr>
+        <w:trPr>
+          <w:trHeight w:val="778"/>
+        </w:trPr>
         <w:tc>
           <w:tcPr>
             <w:tcW w:w="4508" w:type="dxa"/>
@@ -10979,6 +11169,7 @@
           <w:p>
             <w:pPr>
               <w:pStyle w:val="TNR"/>
+              <w:spacing w:after="0"/>
             </w:pPr>
             <w:r>
               <w:t>Fall back to phone/text to stay coordinated. Work offline, or tether/hotspot using mobile data to stay online.</w:t>
@@ -11052,6 +11243,7 @@
               <w:pStyle w:val="TNR"/>
             </w:pPr>
             <w:r>
+              <w:lastRenderedPageBreak/>
               <w:t>R15 Version control conflicts</w:t>
             </w:r>
           </w:p>
@@ -11091,7 +11283,7 @@
         <w:rPr>
           <w:noProof/>
         </w:rPr>
-        <w:t>5</w:t>
+        <w:t>6</w:t>
       </w:r>
       <w:r>
         <w:fldChar w:fldCharType="end"/>
@@ -11155,7 +11347,6 @@
             <w:id w:val="-573587230"/>
             <w:bibliography/>
           </w:sdtPr>
-          <w:sdtEndPr/>
           <w:sdtContent>
             <w:p>
               <w:pPr>
@@ -11468,7 +11659,7 @@
                     <pic:cNvPicPr/>
                   </pic:nvPicPr>
                   <pic:blipFill>
-                    <a:blip r:embed="rId10"/>
+                    <a:blip r:embed="rId11"/>
                     <a:stretch>
                       <a:fillRect/>
                     </a:stretch>
@@ -11893,6 +12084,7 @@
         <w:jc w:val="both"/>
       </w:pPr>
       <w:r>
+        <w:lastRenderedPageBreak/>
         <w:t xml:space="preserve">the nominated computing student(s) (the “Student(s)”) (as listed under section 6); and </w:t>
       </w:r>
     </w:p>
@@ -11958,7 +12150,15 @@
         <w:jc w:val="both"/>
       </w:pPr>
       <w:r>
-        <w:t xml:space="preserve">As part of an established course of study at the Faculty, Bachelor of Information Technology students take a course module IT7x01, in which the Student(s) completes a project (“the Project”) with the Organisation on the basis set out in this Agreement. </w:t>
+        <w:t xml:space="preserve">As part of an established course of study at the Faculty, Bachelor of Information Technology students take a course module IT7x01, in which the </w:t>
+      </w:r>
+      <w:proofErr w:type="gramStart"/>
+      <w:r>
+        <w:t>Student</w:t>
+      </w:r>
+      <w:proofErr w:type="gramEnd"/>
+      <w:r>
+        <w:t xml:space="preserve">(s) completes a project (“the Project”) with the Organisation on the basis set out in this Agreement. </w:t>
       </w:r>
     </w:p>
     <w:p>
@@ -11972,7 +12172,15 @@
         <w:jc w:val="both"/>
       </w:pPr>
       <w:r>
-        <w:t xml:space="preserve">The Organisation agrees to allow the Student(s) access to its premises if needed to undertake that Project on the basis set out in this Agreement. </w:t>
+        <w:t xml:space="preserve">The Organisation agrees to allow the </w:t>
+      </w:r>
+      <w:proofErr w:type="gramStart"/>
+      <w:r>
+        <w:t>Student</w:t>
+      </w:r>
+      <w:proofErr w:type="gramEnd"/>
+      <w:r>
+        <w:t xml:space="preserve">(s) access to its premises if needed to undertake that Project on the basis set out in this Agreement. </w:t>
       </w:r>
     </w:p>
     <w:p>
@@ -11986,7 +12194,15 @@
         <w:jc w:val="both"/>
       </w:pPr>
       <w:r>
-        <w:t xml:space="preserve">The Faculty is satisfied that the Organisation is suitable for the Student(s) Project. </w:t>
+        <w:t xml:space="preserve">The </w:t>
+      </w:r>
+      <w:proofErr w:type="gramStart"/>
+      <w:r>
+        <w:t>Faculty</w:t>
+      </w:r>
+      <w:proofErr w:type="gramEnd"/>
+      <w:r>
+        <w:t xml:space="preserve"> is satisfied that the Organisation is suitable for the Student(s) Project. </w:t>
       </w:r>
     </w:p>
     <w:p>
@@ -12012,7 +12228,6 @@
         <w:ind w:left="283"/>
       </w:pPr>
       <w:r>
-        <w:lastRenderedPageBreak/>
         <w:t xml:space="preserve"> </w:t>
       </w:r>
     </w:p>
@@ -12101,7 +12316,15 @@
         <w:ind w:left="696" w:hanging="427"/>
       </w:pPr>
       <w:r>
-        <w:t xml:space="preserve">2.1 The Organisation has accepted the Student(s) and agrees to allow that Student(s) access to its premises as needed. </w:t>
+        <w:t xml:space="preserve">2.1 The Organisation has accepted the </w:t>
+      </w:r>
+      <w:proofErr w:type="gramStart"/>
+      <w:r>
+        <w:t>Student</w:t>
+      </w:r>
+      <w:proofErr w:type="gramEnd"/>
+      <w:r>
+        <w:t xml:space="preserve">(s) and agrees to allow that Student(s) access to its premises as needed. </w:t>
       </w:r>
     </w:p>
     <w:p>
@@ -12109,7 +12332,15 @@
         <w:ind w:left="696" w:hanging="427"/>
       </w:pPr>
       <w:r>
-        <w:t xml:space="preserve">2.2 The Organisation agrees to be responsible for meeting the requirements of its statutory obligations, e.g. Health and Safety in Employment Act, Human Rights Act, etc., for the Student(s). </w:t>
+        <w:t xml:space="preserve">2.2 The Organisation agrees to be responsible for meeting the requirements of its statutory obligations, e.g. Health and Safety in Employment Act, Human Rights Act, etc., for the </w:t>
+      </w:r>
+      <w:proofErr w:type="gramStart"/>
+      <w:r>
+        <w:t>Student</w:t>
+      </w:r>
+      <w:proofErr w:type="gramEnd"/>
+      <w:r>
+        <w:t xml:space="preserve">(s). </w:t>
       </w:r>
     </w:p>
     <w:p>
@@ -12133,7 +12364,23 @@
         <w:ind w:left="696" w:hanging="427"/>
       </w:pPr>
       <w:r>
-        <w:t xml:space="preserve">2.5 Neither the Faculty nor the Student(s) guarantee specific results and the Project will be undertaken only on a best efforts basis. </w:t>
+        <w:t xml:space="preserve">2.5 Neither the Faculty nor the </w:t>
+      </w:r>
+      <w:proofErr w:type="gramStart"/>
+      <w:r>
+        <w:t>Student</w:t>
+      </w:r>
+      <w:proofErr w:type="gramEnd"/>
+      <w:r>
+        <w:t xml:space="preserve">(s) guarantee specific results and the Project will be undertaken only on a </w:t>
+      </w:r>
+      <w:proofErr w:type="gramStart"/>
+      <w:r>
+        <w:t>best efforts</w:t>
+      </w:r>
+      <w:proofErr w:type="gramEnd"/>
+      <w:r>
+        <w:t xml:space="preserve"> basis. </w:t>
       </w:r>
     </w:p>
     <w:p>
@@ -12154,6 +12401,7 @@
       </w:pPr>
       <w:bookmarkStart w:id="35" w:name="_Toc236998704"/>
       <w:r>
+        <w:lastRenderedPageBreak/>
         <w:t>3</w:t>
       </w:r>
       <w:r>
@@ -12164,7 +12412,15 @@
       </w:r>
       <w:r>
         <w:tab/>
-        <w:t>Copyright, Patents, Trade Marks and other Intellectual Property Rights</w:t>
+        <w:t xml:space="preserve">Copyright, Patents, </w:t>
+      </w:r>
+      <w:proofErr w:type="gramStart"/>
+      <w:r>
+        <w:t>Trade Marks</w:t>
+      </w:r>
+      <w:proofErr w:type="gramEnd"/>
+      <w:r>
+        <w:t xml:space="preserve"> and other Intellectual Property Rights</w:t>
       </w:r>
       <w:bookmarkEnd w:id="35"/>
       <w:r>
@@ -12253,7 +12509,6 @@
         <w:jc w:val="both"/>
       </w:pPr>
       <w:r>
-        <w:lastRenderedPageBreak/>
         <w:t xml:space="preserve">is or later becomes part of the public domain through no fault of the recipient party; </w:t>
       </w:r>
     </w:p>
@@ -12367,7 +12622,23 @@
         <w:ind w:left="696" w:hanging="427"/>
       </w:pPr>
       <w:r>
-        <w:t xml:space="preserve">5.1 The parties agree that both the Faculty and the Student(s) may use the intellectual property rights that are created as a result of the Project work undertaken by each Student for the Organisation for portfolio purposes to promote the Faculty and/or the Student(s). </w:t>
+        <w:t xml:space="preserve">5.1 The parties agree that both the Faculty and the Student(s) may use the intellectual property rights that are created as a result of the Project work undertaken by each Student for the Organisation for portfolio purposes to promote the </w:t>
+      </w:r>
+      <w:proofErr w:type="gramStart"/>
+      <w:r>
+        <w:t>Faculty</w:t>
+      </w:r>
+      <w:proofErr w:type="gramEnd"/>
+      <w:r>
+        <w:t xml:space="preserve"> and/or the </w:t>
+      </w:r>
+      <w:proofErr w:type="gramStart"/>
+      <w:r>
+        <w:t>Student</w:t>
+      </w:r>
+      <w:proofErr w:type="gramEnd"/>
+      <w:r>
+        <w:t xml:space="preserve">(s). </w:t>
       </w:r>
     </w:p>
     <w:p>
@@ -12428,7 +12699,7 @@
                     </pic:cNvPicPr>
                   </pic:nvPicPr>
                   <pic:blipFill>
-                    <a:blip r:embed="rId11" cstate="print">
+                    <a:blip r:embed="rId12" cstate="print">
                       <a:extLst>
                         <a:ext uri="{28A0092B-C50C-407E-A947-70E740481C1C}">
                           <a14:useLocalDpi xmlns:a14="http://schemas.microsoft.com/office/drawing/2010/main" val="0"/>
@@ -12642,6 +12913,7 @@
         <w:ind w:left="1135"/>
       </w:pPr>
       <w:r>
+        <w:lastRenderedPageBreak/>
         <w:t xml:space="preserve">The Custom property will be vested solely in the Organisation whereas Generic property will vest solely in each respective Student.  Each Student hereby grants the Organisation and where more than one Student has been involved in the Project, the other Student(s), a perpetual non-exclusive licence for that Generic property. </w:t>
       </w:r>
     </w:p>
@@ -13170,7 +13442,6 @@
               <w:rPr>
                 <w:rFonts w:ascii="Times New Roman" w:hAnsi="Times New Roman" w:cs="Times New Roman"/>
               </w:rPr>
-              <w:lastRenderedPageBreak/>
               <w:t xml:space="preserve">Student  </w:t>
             </w:r>
           </w:p>
@@ -13643,7 +13914,7 @@
       </w:pPr>
     </w:p>
     <w:sectPr>
-      <w:footerReference w:type="default" r:id="rId12"/>
+      <w:footerReference w:type="default" r:id="rId13"/>
       <w:pgSz w:w="11906" w:h="16838"/>
       <w:pgMar w:top="720" w:right="720" w:bottom="720" w:left="720" w:header="708" w:footer="708" w:gutter="0"/>
       <w:pgNumType w:start="0"/>
@@ -13690,7 +13961,6 @@
         <w:docPartUnique/>
       </w:docPartObj>
     </w:sdtPr>
-    <w:sdtEndPr/>
     <w:sdtContent>
       <w:p>
         <w:pPr>
@@ -16092,6 +16362,18 @@
       <w:ind w:left="440"/>
     </w:pPr>
   </w:style>
+  <w:style w:type="character" w:styleId="UnresolvedMention">
+    <w:name w:val="Unresolved Mention"/>
+    <w:basedOn w:val="DefaultParagraphFont"/>
+    <w:uiPriority w:val="99"/>
+    <w:semiHidden/>
+    <w:unhideWhenUsed/>
+    <w:rsid w:val="001367FB"/>
+    <w:rPr>
+      <w:color w:val="605E5C"/>
+      <w:shd w:val="clear" w:color="auto" w:fill="E1DFDD"/>
+    </w:rPr>
+  </w:style>
 </w:styles>
 </file>
 

</xml_diff>

<commit_message>
Project plan update, minus AI bit
</commit_message>
<xml_diff>
--- a/BHB - Capstone Proposal.docx
+++ b/BHB - Capstone Proposal.docx
@@ -3777,8 +3777,13 @@
                                   </w:rPr>
                                 </w:pPr>
                                 <w:r>
-                                  <w:t>Whitireia and WelTec</w:t>
+                                  <w:t xml:space="preserve">Whitireia and </w:t>
                                 </w:r>
+                                <w:proofErr w:type="spellStart"/>
+                                <w:r>
+                                  <w:t>WelTec</w:t>
+                                </w:r>
+                                <w:proofErr w:type="spellEnd"/>
                               </w:p>
                             </w:txbxContent>
                           </wps:txbx>
@@ -3871,8 +3876,13 @@
                             </w:rPr>
                           </w:pPr>
                           <w:r>
-                            <w:t>Whitireia and WelTec</w:t>
+                            <w:t xml:space="preserve">Whitireia and </w:t>
                           </w:r>
+                          <w:proofErr w:type="spellStart"/>
+                          <w:r>
+                            <w:t>WelTec</w:t>
+                          </w:r>
+                          <w:proofErr w:type="spellEnd"/>
                         </w:p>
                       </w:txbxContent>
                     </v:textbox>
@@ -6538,13 +6548,13 @@
       </w:sdtContent>
     </w:sdt>
     <w:p/>
-    <w:p/>
     <w:p>
       <w:pPr>
         <w:pStyle w:val="Heading1"/>
       </w:pPr>
       <w:bookmarkStart w:id="0" w:name="_Toc236998676"/>
       <w:r>
+        <w:lastRenderedPageBreak/>
         <w:t>Project Objective</w:t>
       </w:r>
       <w:bookmarkEnd w:id="0"/>
@@ -6564,7 +6574,16 @@
         <w:pStyle w:val="TNR"/>
       </w:pPr>
       <w:r>
-        <w:t xml:space="preserve">The client for this project is Geoff Gordon who is a Network Administrator for </w:t>
+        <w:t>The client for this project is Geoff Gordon</w:t>
+      </w:r>
+      <w:r>
+        <w:t>,</w:t>
+      </w:r>
+      <w:r>
+        <w:t xml:space="preserve"> who is a Network Administrator for </w:t>
+      </w:r>
+      <w:r>
+        <w:t xml:space="preserve">Whitireia and </w:t>
       </w:r>
       <w:proofErr w:type="spellStart"/>
       <w:r>
@@ -6572,7 +6591,13 @@
       </w:r>
       <w:proofErr w:type="spellEnd"/>
       <w:r>
-        <w:t xml:space="preserve"> and Whitireia, a local Polytechnic that is </w:t>
+        <w:t xml:space="preserve">, a local </w:t>
+      </w:r>
+      <w:r>
+        <w:t>p</w:t>
+      </w:r>
+      <w:r>
+        <w:t xml:space="preserve">olytechnic that is </w:t>
       </w:r>
       <w:r>
         <w:t xml:space="preserve">a subsidiary of </w:t>
@@ -6600,7 +6625,31 @@
         <w:t xml:space="preserve"> Institute of Skills and Technology</w:t>
       </w:r>
       <w:r>
-        <w:t xml:space="preserve">. Geoff offers technical support to staff, students and lecturers’ and is an on-site “fix-it” man for delivering technical solutions and helpful ideas (Whitireia &amp; </w:t>
+        <w:t>. Geoff offers technical support to staff, students and lecturers</w:t>
+      </w:r>
+      <w:r>
+        <w:t>,</w:t>
+      </w:r>
+      <w:r>
+        <w:t xml:space="preserve"> and </w:t>
+      </w:r>
+      <w:r>
+        <w:t xml:space="preserve">acts as </w:t>
+      </w:r>
+      <w:r>
+        <w:t xml:space="preserve">an on-site “fix-it” </w:t>
+      </w:r>
+      <w:r>
+        <w:t>man</w:t>
+      </w:r>
+      <w:r>
+        <w:t xml:space="preserve"> for delivering technical solutions and </w:t>
+      </w:r>
+      <w:r>
+        <w:t>practical</w:t>
+      </w:r>
+      <w:r>
+        <w:t xml:space="preserve"> ideas (Whitireia &amp; </w:t>
       </w:r>
       <w:proofErr w:type="spellStart"/>
       <w:r>
@@ -6622,15 +6671,61 @@
         <w:pStyle w:val="TNR"/>
       </w:pPr>
       <w:r>
-        <w:t xml:space="preserve">The key problem they would like solved is the comparison of traditional forensic tools to AI versions of forensic tools so that we may develop an analysis of whether or not AI is a worthwhile venture for forensics or if it uses an unreasonable </w:t>
-      </w:r>
-      <w:proofErr w:type="gramStart"/>
-      <w:r>
-        <w:t>amount</w:t>
-      </w:r>
-      <w:proofErr w:type="gramEnd"/>
-      <w:r>
-        <w:t xml:space="preserve"> of resources. </w:t>
+        <w:t xml:space="preserve">The key problem </w:t>
+      </w:r>
+      <w:r>
+        <w:t xml:space="preserve">Geoff wants </w:t>
+      </w:r>
+      <w:r>
+        <w:t xml:space="preserve">solved is </w:t>
+      </w:r>
+      <w:r>
+        <w:t>a structured</w:t>
+      </w:r>
+      <w:r>
+        <w:t xml:space="preserve"> comparison of traditional forensic tools </w:t>
+      </w:r>
+      <w:r>
+        <w:t>against their</w:t>
+      </w:r>
+      <w:r>
+        <w:t xml:space="preserve"> AI </w:t>
+      </w:r>
+      <w:r>
+        <w:t>augmented counterparts.</w:t>
+      </w:r>
+      <w:r>
+        <w:t xml:space="preserve"> Geoff is interested in whether AI-based </w:t>
+      </w:r>
+      <w:r>
+        <w:t xml:space="preserve">forensic tools </w:t>
+      </w:r>
+      <w:r>
+        <w:t xml:space="preserve">meaningfully improve the process, </w:t>
+      </w:r>
+      <w:r>
+        <w:t>to determine</w:t>
+      </w:r>
+      <w:r>
+        <w:t xml:space="preserve"> whether the additional computational resources that they require </w:t>
+      </w:r>
+      <w:r>
+        <w:t xml:space="preserve">is a worthwhile </w:t>
+      </w:r>
+      <w:r>
+        <w:t>expenditure</w:t>
+      </w:r>
+      <w:r>
+        <w:t xml:space="preserve"> for forensics or </w:t>
+      </w:r>
+      <w:r>
+        <w:t xml:space="preserve">if it </w:t>
+      </w:r>
+      <w:r>
+        <w:t>is unjustifiable</w:t>
+      </w:r>
+      <w:r>
+        <w:t xml:space="preserve">. </w:t>
       </w:r>
     </w:p>
     <w:p>
@@ -6648,11 +6743,54 @@
         <w:pStyle w:val="TNR"/>
       </w:pPr>
       <w:r>
-        <w:t xml:space="preserve">The main deliverable for this project will be a research report that discusses our working output and analysis for every file that we have tested our tools and locally hosted AI on and the resulting output of our findings. The deliverables will also include either a live demonstration or a video demonstration depending on the viability of what is included within it. </w:t>
-      </w:r>
-      <w:r>
-        <w:br/>
-        <w:t>JUST A VIDEO, NOT A LIVE DEMO</w:t>
+        <w:t xml:space="preserve">The </w:t>
+      </w:r>
+      <w:r>
+        <w:t>primary</w:t>
+      </w:r>
+      <w:r>
+        <w:t xml:space="preserve"> deliverable for this project </w:t>
+      </w:r>
+      <w:r>
+        <w:t>is</w:t>
+      </w:r>
+      <w:r>
+        <w:t xml:space="preserve"> a research report that </w:t>
+      </w:r>
+      <w:r>
+        <w:t xml:space="preserve">presents the working output and analysis of each test file processed using both traditional and AI-augmented forensic tools. </w:t>
+      </w:r>
+      <w:r>
+        <w:t xml:space="preserve">The report with document the testing process, metrics used to assess each tool, and the resulting comparative findings and recommendation. </w:t>
+      </w:r>
+    </w:p>
+    <w:p>
+      <w:pPr>
+        <w:pStyle w:val="TNR"/>
+      </w:pPr>
+      <w:r>
+        <w:t>In addition to the written report, the project will include a video recording that demonstrates each tool</w:t>
+      </w:r>
+      <w:r>
+        <w:t xml:space="preserve"> in</w:t>
+      </w:r>
+      <w:r>
+        <w:t xml:space="preserve"> use</w:t>
+      </w:r>
+      <w:r>
+        <w:t xml:space="preserve"> against the test dataset</w:t>
+      </w:r>
+      <w:r>
+        <w:t>. Th</w:t>
+      </w:r>
+      <w:r>
+        <w:t>e video will serve as evidence that the described testing was performed, showing the tools being run, as well as their configuration and outputs.</w:t>
+      </w:r>
+      <w:r>
+        <w:t xml:space="preserve"> The combination of a written report and video evidence should ensure the project’s findings are transparent</w:t>
+      </w:r>
+      <w:r>
+        <w:t>, reproducible, and verifiable by the client and project advisor.</w:t>
       </w:r>
     </w:p>
     <w:p>
@@ -6670,7 +6808,63 @@
         <w:pStyle w:val="TNR"/>
       </w:pPr>
       <w:r>
-        <w:t xml:space="preserve">The main project ‘must have’ is proving that both types of tools can be run on one machine and having a test plan that can be completed by both types of tools. It is important that the final report includes a discussion on what sections of the forensic process have been impacted the most by Artificial Intelligence and what makes it worth using the resources. This discussion must also include why exactly it is worth it or not worth it, to invest in the resources into using AI. </w:t>
+        <w:t xml:space="preserve">The main </w:t>
+      </w:r>
+      <w:r>
+        <w:t xml:space="preserve">requirement of this project is proving that both traditional and AI-augmented forensic tools can be run on a single, locally hosted machine. </w:t>
+      </w:r>
+      <w:r>
+        <w:t xml:space="preserve">They must use a shared test plan that both types of </w:t>
+      </w:r>
+      <w:r>
+        <w:t>tools</w:t>
+      </w:r>
+      <w:r>
+        <w:t xml:space="preserve"> can be tested against under the same conditions. </w:t>
+      </w:r>
+      <w:r>
+        <w:t xml:space="preserve">This baseline is important for </w:t>
+      </w:r>
+      <w:r>
+        <w:t xml:space="preserve">a fair comparison, since hardware, dataset, and test conditions </w:t>
+      </w:r>
+      <w:r>
+        <w:t xml:space="preserve">are variables that must be controlled for </w:t>
+      </w:r>
+      <w:r>
+        <w:t>a valid experiment to be run.</w:t>
+      </w:r>
+    </w:p>
+    <w:p>
+      <w:pPr>
+        <w:pStyle w:val="TNR"/>
+      </w:pPr>
+      <w:r>
+        <w:t>The final report must</w:t>
+      </w:r>
+      <w:r>
+        <w:t xml:space="preserve"> include a discussion o</w:t>
+      </w:r>
+      <w:r>
+        <w:t>f</w:t>
+      </w:r>
+      <w:r>
+        <w:t xml:space="preserve"> wh</w:t>
+      </w:r>
+      <w:r>
+        <w:t>ich</w:t>
+      </w:r>
+      <w:r>
+        <w:t xml:space="preserve"> </w:t>
+      </w:r>
+      <w:r>
+        <w:t>stages of the forensic process (</w:t>
+      </w:r>
+      <w:r>
+        <w:t xml:space="preserve">evidence acquisition, memory analysis, file carving, metadata extraction) are most affected by the introduction of AI, and much clearly state </w:t>
+      </w:r>
+      <w:r>
+        <w:t>whether the resource cost of AI-augmented tools is justified by improvements in accuracy, speed, or usability.</w:t>
       </w:r>
     </w:p>
     <w:p>
@@ -6688,31 +6882,64 @@
         <w:pStyle w:val="TNR"/>
       </w:pPr>
       <w:r>
-        <w:t xml:space="preserve">The ethicality and risks of data leakage aren’t necessarily </w:t>
-      </w:r>
-      <w:r>
-        <w:t>required as part</w:t>
-      </w:r>
-      <w:r>
-        <w:t xml:space="preserve"> of the project but would be considered a </w:t>
-      </w:r>
-      <w:r>
-        <w:t>‘</w:t>
-      </w:r>
-      <w:r>
-        <w:t>nice to have</w:t>
-      </w:r>
-      <w:r>
-        <w:t>’</w:t>
-      </w:r>
-      <w:r>
-        <w:t xml:space="preserve"> in the final version. Other ‘luxuries’ would include testing on larger models; however, this does come at the cost of requiring more equipment such as higher-end GPUs with more memory. Therefore, being able to test on a setup with </w:t>
-      </w:r>
-      <w:r>
-        <w:t>two</w:t>
-      </w:r>
-      <w:r>
-        <w:t xml:space="preserve"> graphics cards is considered superfluous but will be excellent to include if we are able to manage that. </w:t>
+        <w:t>An investigation into the ethicality and risk of data leakage with AI</w:t>
+      </w:r>
+      <w:r>
+        <w:t>-based forensic tools is not strictly</w:t>
+      </w:r>
+      <w:r>
+        <w:t xml:space="preserve"> </w:t>
+      </w:r>
+      <w:r>
+        <w:t xml:space="preserve">required </w:t>
+      </w:r>
+      <w:r>
+        <w:t xml:space="preserve">for this </w:t>
+      </w:r>
+      <w:r>
+        <w:t xml:space="preserve">project but </w:t>
+      </w:r>
+      <w:r>
+        <w:t xml:space="preserve">is </w:t>
+      </w:r>
+      <w:r>
+        <w:t xml:space="preserve">considered a </w:t>
+      </w:r>
+      <w:r>
+        <w:t>valuable addition if time allows.</w:t>
+      </w:r>
+      <w:r>
+        <w:t xml:space="preserve"> Other </w:t>
+      </w:r>
+      <w:r>
+        <w:t>optional additions</w:t>
+      </w:r>
+      <w:r>
+        <w:t xml:space="preserve"> include testing on larger models</w:t>
+      </w:r>
+      <w:r>
+        <w:t>, which would require additional equipment such as</w:t>
+      </w:r>
+      <w:r>
+        <w:t xml:space="preserve"> higher-end GPUs with more memory. Therefore, test</w:t>
+      </w:r>
+      <w:r>
+        <w:t>ing on a dual-</w:t>
+      </w:r>
+      <w:r>
+        <w:t>G</w:t>
+      </w:r>
+      <w:r>
+        <w:t>PU</w:t>
+      </w:r>
+      <w:r>
+        <w:t xml:space="preserve"> setup is considered </w:t>
+      </w:r>
+      <w:r>
+        <w:t>a stretch goal rather than a requirement.</w:t>
+      </w:r>
+      <w:r>
+        <w:t xml:space="preserve"> </w:t>
       </w:r>
     </w:p>
     <w:p>
@@ -6720,7 +6947,37 @@
         <w:pStyle w:val="TNR"/>
       </w:pPr>
       <w:r>
-        <w:t xml:space="preserve">It is also of mention that one of the outputs you could expect with more technology available, is the ability to see if the larger model output is worth the extra resources invested. This is due to the fact that accuracy is a very important factor in the production of a forensics report. Having the ability to tell if more resources invested leads to a higher degree of usefulness/quality from the AI, would be helpful. </w:t>
+        <w:t xml:space="preserve">It is also </w:t>
+      </w:r>
+      <w:r>
+        <w:t xml:space="preserve">useful to establish whether </w:t>
+      </w:r>
+      <w:r>
+        <w:t>output of a</w:t>
+      </w:r>
+      <w:r>
+        <w:t xml:space="preserve"> larger model is worth the extra resources </w:t>
+      </w:r>
+      <w:r>
+        <w:t>it requires, compared to a smaller model</w:t>
+      </w:r>
+      <w:r>
+        <w:t xml:space="preserve">. This is due to the fact that accuracy is a very important factor in the production of a forensics report. </w:t>
+      </w:r>
+      <w:r>
+        <w:t>Determining whether investing more resources</w:t>
+      </w:r>
+      <w:r>
+        <w:t xml:space="preserve"> produces </w:t>
+      </w:r>
+      <w:r>
+        <w:t>a</w:t>
+      </w:r>
+      <w:r>
+        <w:t xml:space="preserve"> higher quality or more usable output would be valuable to the project’s conclusions.</w:t>
+      </w:r>
+      <w:r>
+        <w:t xml:space="preserve"> </w:t>
       </w:r>
     </w:p>
     <w:p>
@@ -6728,18 +6985,44 @@
         <w:pStyle w:val="TNR"/>
       </w:pPr>
       <w:r>
-        <w:t xml:space="preserve">Another extra addition to the project could be an environment or scripts that help to automate certain activities. If it is within our capability, having a record that data is not leaving the network by tracking the flow of packets from the computer during the extent of this project is also something that can be considered as a stretch goal. </w:t>
-      </w:r>
-    </w:p>
-    <w:p>
-      <w:pPr>
-        <w:pStyle w:val="TNR"/>
-      </w:pPr>
-    </w:p>
-    <w:p>
-      <w:pPr>
-        <w:pStyle w:val="TNR"/>
-      </w:pPr>
+        <w:t>A</w:t>
+      </w:r>
+      <w:r>
+        <w:t xml:space="preserve">ddition </w:t>
+      </w:r>
+      <w:r>
+        <w:t xml:space="preserve">stretch goals include </w:t>
+      </w:r>
+      <w:r>
+        <w:t xml:space="preserve">developing scripts or </w:t>
+      </w:r>
+      <w:r>
+        <w:t xml:space="preserve">an environment to automate </w:t>
+      </w:r>
+      <w:r>
+        <w:t>parts of the testing process, and</w:t>
+      </w:r>
+      <w:r>
+        <w:t xml:space="preserve"> monitoring network traffic during testing to </w:t>
+      </w:r>
+      <w:r>
+        <w:t xml:space="preserve">confirm that </w:t>
+      </w:r>
+      <w:r>
+        <w:t xml:space="preserve">data is </w:t>
+      </w:r>
+      <w:r>
+        <w:t xml:space="preserve">not </w:t>
+      </w:r>
+      <w:r>
+        <w:t>leaving the network</w:t>
+      </w:r>
+      <w:r>
+        <w:t>.</w:t>
+      </w:r>
+      <w:r>
+        <w:t xml:space="preserve"> </w:t>
+      </w:r>
     </w:p>
     <w:p>
       <w:pPr>
@@ -6757,13 +7040,74 @@
         <w:pStyle w:val="TNR"/>
       </w:pPr>
       <w:r>
-        <w:t xml:space="preserve">Tools that can be run in the Kali Linux environment for the intended uses of performing digital forensics against publicly available datasets are within the scope of this project. Forensic testing and analysis will be performed on OS and mobile-based datasets. As forensics expands a wide variety of activities such as data-carving, memory forensics and network forensics, these will all be considered in-scope for this project as we are looking to test these tools against a variety of different datasets to display their strengths and weaknesses.  The testing of legacy forensics tools and tools that are aided by artificial intelligence are in scope as we are looking to compare the two types of </w:t>
-      </w:r>
-      <w:proofErr w:type="gramStart"/>
-      <w:r>
-        <w:t>tool</w:t>
-      </w:r>
-      <w:proofErr w:type="gramEnd"/>
+        <w:t xml:space="preserve">Tools that can be run in the Kali Linux environment for the intended uses of performing digital forensics against publicly available datasets are within the scope of this project. Forensic testing and analysis will be performed on </w:t>
+      </w:r>
+      <w:r>
+        <w:t>operating system (OS)</w:t>
+      </w:r>
+      <w:r>
+        <w:t xml:space="preserve"> and mobile-based datasets. As </w:t>
+      </w:r>
+      <w:r>
+        <w:t xml:space="preserve">digital </w:t>
+      </w:r>
+      <w:r>
+        <w:t xml:space="preserve">forensics </w:t>
+      </w:r>
+      <w:r>
+        <w:t>covers</w:t>
+      </w:r>
+      <w:r>
+        <w:t xml:space="preserve"> a wide variety of activities such as data-carving, memory forensics</w:t>
+      </w:r>
+      <w:r>
+        <w:t>,</w:t>
+      </w:r>
+      <w:r>
+        <w:t xml:space="preserve"> and network forensics, these </w:t>
+      </w:r>
+      <w:r>
+        <w:t>are</w:t>
+      </w:r>
+      <w:r>
+        <w:t xml:space="preserve"> all considered in-scope for this project</w:t>
+      </w:r>
+      <w:r>
+        <w:t>,</w:t>
+      </w:r>
+      <w:r>
+        <w:t xml:space="preserve"> as we are looking to test these tools against a variety of different datasets to display their strengths and weaknesses. The testing of </w:t>
+      </w:r>
+      <w:r>
+        <w:t xml:space="preserve">both </w:t>
+      </w:r>
+      <w:r>
+        <w:t xml:space="preserve">legacy forensics tools and </w:t>
+      </w:r>
+      <w:r>
+        <w:t xml:space="preserve">AI-augmented </w:t>
+      </w:r>
+      <w:r>
+        <w:t xml:space="preserve">forensic </w:t>
+      </w:r>
+      <w:r>
+        <w:t>tools are in scope</w:t>
+      </w:r>
+      <w:r>
+        <w:t>,</w:t>
+      </w:r>
+      <w:r>
+        <w:t xml:space="preserve"> as </w:t>
+      </w:r>
+      <w:r>
+        <w:t>the aim of the project is to compare</w:t>
+      </w:r>
+      <w:r>
+        <w:t xml:space="preserve"> the two types of </w:t>
+      </w:r>
+      <w:r>
+        <w:t>tools</w:t>
+      </w:r>
       <w:r>
         <w:t xml:space="preserve">. The analysis and documentation of said testing is also within scope. </w:t>
       </w:r>
@@ -6794,15 +7138,16 @@
         <w:t>a full investigation into them is</w:t>
       </w:r>
       <w:r>
-        <w:t xml:space="preserve"> considered to be outside the scope of this project. Cloud-based tools are also out of </w:t>
-      </w:r>
-      <w:proofErr w:type="gramStart"/>
-      <w:r>
-        <w:t>scope,</w:t>
-      </w:r>
-      <w:proofErr w:type="gramEnd"/>
-      <w:r>
-        <w:t xml:space="preserve"> this is because the machine we will be working on is a locally hosted machine on a local network.</w:t>
+        <w:t xml:space="preserve"> considered to be outside the scope of this project. Cloud-based tools are also out of scope, because the machine we will be working on is a locally hosted machine on a local network</w:t>
+      </w:r>
+      <w:r>
+        <w:t>,</w:t>
+      </w:r>
+      <w:r>
+        <w:t xml:space="preserve"> to avoid transmitting potentially sensitive forensic data externally</w:t>
+      </w:r>
+      <w:r>
+        <w:t>.</w:t>
       </w:r>
     </w:p>
     <w:p>
@@ -6810,10 +7155,52 @@
         <w:pStyle w:val="TNR"/>
       </w:pPr>
       <w:r>
-        <w:t>We are not interested in our model’s abilities to generate reports, or come to conclusions based on our evidence, our investigation into the efficacy of these tools is in their empirical capacity. Essentially their usefulness to an examiner as opposed to an investigator.</w:t>
-      </w:r>
-      <w:r>
-        <w:t xml:space="preserve"> EXPLAIN WHAT THESE ROLES ARE/DO. NOT EVERYBODY IS DF BACKGROUND.</w:t>
+        <w:t xml:space="preserve">This project is </w:t>
+      </w:r>
+      <w:r>
+        <w:t xml:space="preserve">not </w:t>
+      </w:r>
+      <w:r>
+        <w:t xml:space="preserve">concerned </w:t>
+      </w:r>
+      <w:r>
+        <w:t xml:space="preserve">in </w:t>
+      </w:r>
+      <w:r>
+        <w:t>the</w:t>
+      </w:r>
+      <w:r>
+        <w:t xml:space="preserve"> model’s abilities to generate reports or </w:t>
+      </w:r>
+      <w:r>
+        <w:t xml:space="preserve">draw </w:t>
+      </w:r>
+      <w:r>
+        <w:t xml:space="preserve">conclusions based on </w:t>
+      </w:r>
+      <w:r>
+        <w:t xml:space="preserve">the </w:t>
+      </w:r>
+      <w:r>
+        <w:t>evidence</w:t>
+      </w:r>
+      <w:r>
+        <w:t xml:space="preserve">. The </w:t>
+      </w:r>
+      <w:r>
+        <w:t xml:space="preserve">investigation </w:t>
+      </w:r>
+      <w:r>
+        <w:t xml:space="preserve">is </w:t>
+      </w:r>
+      <w:r>
+        <w:t xml:space="preserve">into the efficacy of these tools in their empirical capacity. Essentially their usefulness </w:t>
+      </w:r>
+      <w:r>
+        <w:t xml:space="preserve">is limited to </w:t>
+      </w:r>
+      <w:r>
+        <w:t>analysing and interpreting data, rather than collecting and preserving it.</w:t>
       </w:r>
     </w:p>
     <w:p>
@@ -6834,13 +7221,8 @@
         <w:rPr>
           <w:lang w:val="en-NZ"/>
         </w:rPr>
-        <w:t>Half a page discussing how AI is relevant to this project. Needs citations.</w:t>
-      </w:r>
-    </w:p>
-    <w:p>
-      <w:pPr>
-        <w:pStyle w:val="TNR"/>
-      </w:pPr>
+        <w:t>https://www.sciencedirect.com/science/article/pii/S2666281723001944</w:t>
+      </w:r>
     </w:p>
     <w:p>
       <w:pPr>
@@ -6848,68 +7230,65 @@
           <w:lang w:val="en-NZ"/>
         </w:rPr>
       </w:pPr>
-    </w:p>
-    <w:p>
-      <w:pPr>
+      <w:r>
         <w:rPr>
           <w:lang w:val="en-NZ"/>
         </w:rPr>
-      </w:pPr>
-    </w:p>
-    <w:p>
-      <w:pPr>
+        <w:t>This project uses AI in two methods. The first method is AI-augmented forensic tools</w:t>
+      </w:r>
+      <w:r>
         <w:rPr>
           <w:lang w:val="en-NZ"/>
         </w:rPr>
-      </w:pPr>
-    </w:p>
-    <w:p>
-      <w:pPr>
+        <w:t xml:space="preserve"> will be</w:t>
+      </w:r>
+      <w:r>
         <w:rPr>
           <w:lang w:val="en-NZ"/>
         </w:rPr>
-      </w:pPr>
-    </w:p>
-    <w:p>
-      <w:pPr>
+        <w:t xml:space="preserve"> run locally in LM</w:t>
+      </w:r>
+      <w:r>
         <w:rPr>
           <w:lang w:val="en-NZ"/>
         </w:rPr>
-      </w:pPr>
-    </w:p>
-    <w:p>
-      <w:pPr>
+        <w:t xml:space="preserve"> S</w:t>
+      </w:r>
+      <w:r>
         <w:rPr>
           <w:lang w:val="en-NZ"/>
         </w:rPr>
-      </w:pPr>
-    </w:p>
-    <w:p>
-      <w:pPr>
+        <w:t>tudio</w:t>
+      </w:r>
+      <w:r>
         <w:rPr>
           <w:lang w:val="en-NZ"/>
         </w:rPr>
-      </w:pPr>
-    </w:p>
-    <w:p>
-      <w:pPr>
+        <w:t>, and tested against</w:t>
+      </w:r>
+      <w:r>
         <w:rPr>
           <w:lang w:val="en-NZ"/>
         </w:rPr>
-      </w:pPr>
-    </w:p>
-    <w:p>
-      <w:pPr>
+        <w:t xml:space="preserve"> the legacy </w:t>
+      </w:r>
+      <w:r>
         <w:rPr>
           <w:lang w:val="en-NZ"/>
         </w:rPr>
-      </w:pPr>
-    </w:p>
-    <w:p>
-      <w:pPr>
+        <w:t>forensic tools that don’t use AI, using the same dataset. This will allow for a comparison of output, accuracy, and resource use.</w:t>
+      </w:r>
+      <w:r>
         <w:rPr>
           <w:lang w:val="en-NZ"/>
         </w:rPr>
+        <w:br/>
+        <w:t>The second method is</w:t>
+      </w:r>
+    </w:p>
+    <w:p>
+      <w:pPr>
+        <w:pStyle w:val="TNR"/>
       </w:pPr>
     </w:p>
     <w:p>
@@ -6970,10 +7349,18 @@
     </w:p>
     <w:p>
       <w:pPr>
+        <w:rPr>
+          <w:lang w:val="en-NZ"/>
+        </w:rPr>
+      </w:pPr>
+    </w:p>
+    <w:p>
+      <w:pPr>
         <w:pStyle w:val="Heading1"/>
       </w:pPr>
       <w:bookmarkStart w:id="6" w:name="_Toc236998682"/>
       <w:r>
+        <w:lastRenderedPageBreak/>
         <w:t>Project Plan</w:t>
       </w:r>
       <w:bookmarkEnd w:id="6"/>
@@ -7338,40 +7725,40 @@
         <w:pStyle w:val="TNR"/>
       </w:pPr>
       <w:r>
+        <w:t>KALI VERSION NUMBER</w:t>
+      </w:r>
+    </w:p>
+    <w:p>
+      <w:pPr>
+        <w:pStyle w:val="TNR"/>
+      </w:pPr>
+      <w:r>
+        <w:t>DISCUSS FORENSIC TOOLS</w:t>
+      </w:r>
+      <w:r>
+        <w:t xml:space="preserve"> WE </w:t>
+      </w:r>
+      <w:proofErr w:type="gramStart"/>
+      <w:r>
+        <w:t>ASSESSING</w:t>
+      </w:r>
+      <w:proofErr w:type="gramEnd"/>
+      <w:r>
+        <w:t xml:space="preserve"> (Version number + Citations)</w:t>
+      </w:r>
+    </w:p>
+    <w:p>
+      <w:pPr>
+        <w:pStyle w:val="TNR"/>
+      </w:pPr>
+    </w:p>
+    <w:p>
+      <w:pPr>
+        <w:pStyle w:val="Heading2"/>
+      </w:pPr>
+      <w:bookmarkStart w:id="11" w:name="_Toc236998687"/>
+      <w:r>
         <w:lastRenderedPageBreak/>
-        <w:t>KALI VERSION NUMBER</w:t>
-      </w:r>
-    </w:p>
-    <w:p>
-      <w:pPr>
-        <w:pStyle w:val="TNR"/>
-      </w:pPr>
-      <w:r>
-        <w:t>DISCUSS FORENSIC TOOLS</w:t>
-      </w:r>
-      <w:r>
-        <w:t xml:space="preserve"> WE </w:t>
-      </w:r>
-      <w:proofErr w:type="gramStart"/>
-      <w:r>
-        <w:t>ASSESSING</w:t>
-      </w:r>
-      <w:proofErr w:type="gramEnd"/>
-      <w:r>
-        <w:t xml:space="preserve"> (Version number + Citations)</w:t>
-      </w:r>
-    </w:p>
-    <w:p>
-      <w:pPr>
-        <w:pStyle w:val="TNR"/>
-      </w:pPr>
-    </w:p>
-    <w:p>
-      <w:pPr>
-        <w:pStyle w:val="Heading2"/>
-      </w:pPr>
-      <w:bookmarkStart w:id="11" w:name="_Toc236998687"/>
-      <w:r>
         <w:t>Project budget</w:t>
       </w:r>
       <w:bookmarkEnd w:id="11"/>
@@ -7667,7 +8054,6 @@
               <w:pStyle w:val="TNR"/>
             </w:pPr>
             <w:r>
-              <w:lastRenderedPageBreak/>
               <w:t>Dave Sushames</w:t>
             </w:r>
           </w:p>
@@ -7740,6 +8126,7 @@
       <w:bookmarkStart w:id="18" w:name="_Toc236665778"/>
       <w:bookmarkStart w:id="19" w:name="_Toc236998691"/>
       <w:r>
+        <w:lastRenderedPageBreak/>
         <w:t>Project Advisor</w:t>
       </w:r>
       <w:bookmarkEnd w:id="18"/>
@@ -8213,7 +8600,6 @@
       <w:bookmarkStart w:id="24" w:name="_Toc236665781"/>
       <w:bookmarkStart w:id="25" w:name="_Toc236998694"/>
       <w:r>
-        <w:lastRenderedPageBreak/>
         <w:t>RACI assessment matrix</w:t>
       </w:r>
       <w:bookmarkEnd w:id="24"/>
@@ -8376,6 +8762,7 @@
                 <w:b/>
                 <w:bCs/>
               </w:rPr>
+              <w:lastRenderedPageBreak/>
               <w:t>Installation, management of physical hardware.</w:t>
             </w:r>
           </w:p>
@@ -9927,7 +10314,6 @@
                 <w:bCs/>
                 <w:lang w:val="en-NZ"/>
               </w:rPr>
-              <w:lastRenderedPageBreak/>
               <w:t>4</w:t>
             </w:r>
           </w:p>
@@ -10063,6 +10449,7 @@
               <w:pStyle w:val="TNR"/>
             </w:pPr>
             <w:r>
+              <w:lastRenderedPageBreak/>
               <w:t>R06 Software difficulties.</w:t>
             </w:r>
           </w:p>
@@ -10509,7 +10896,6 @@
               <w:pStyle w:val="TNR"/>
             </w:pPr>
             <w:r>
-              <w:lastRenderedPageBreak/>
               <w:t>R05 Misunderstood requirements</w:t>
             </w:r>
           </w:p>
@@ -10588,7 +10974,11 @@
               <w:t>n inconspicuous location.</w:t>
             </w:r>
             <w:r>
-              <w:t xml:space="preserve"> Label components with owner’s name. </w:t>
+              <w:t xml:space="preserve"> Label components </w:t>
+            </w:r>
+            <w:r>
+              <w:lastRenderedPageBreak/>
+              <w:t xml:space="preserve">with owner’s name. </w:t>
             </w:r>
             <w:r>
               <w:t>Have photo proof of ownership.</w:t>
@@ -10606,6 +10996,7 @@
               <w:pStyle w:val="TNR"/>
             </w:pPr>
             <w:r>
+              <w:lastRenderedPageBreak/>
               <w:t>R08 Data/File loss/corruption</w:t>
             </w:r>
           </w:p>
@@ -10919,7 +11310,6 @@
               <w:pStyle w:val="TNR"/>
             </w:pPr>
             <w:r>
-              <w:lastRenderedPageBreak/>
               <w:t>R01 Missed deadlines</w:t>
             </w:r>
           </w:p>
@@ -11004,6 +11394,7 @@
               <w:pStyle w:val="TNR"/>
             </w:pPr>
             <w:r>
+              <w:lastRenderedPageBreak/>
               <w:t>R04 Formatting inconsistencies</w:t>
             </w:r>
           </w:p>
@@ -11308,7 +11699,6 @@
               <w:pStyle w:val="TNR"/>
             </w:pPr>
             <w:r>
-              <w:lastRenderedPageBreak/>
               <w:t>R14 Power outage</w:t>
             </w:r>
           </w:p>
@@ -11405,6 +11795,7 @@
         <w:rPr>
           <w:rFonts w:ascii="Times New Roman" w:eastAsiaTheme="minorEastAsia" w:hAnsi="Times New Roman" w:cstheme="minorBidi"/>
           <w:b w:val="0"/>
+          <w:bCs w:val="0"/>
           <w:kern w:val="0"/>
           <w:sz w:val="22"/>
           <w:szCs w:val="22"/>
@@ -11420,7 +11811,6 @@
       </w:sdtPr>
       <w:sdtEndPr>
         <w:rPr>
-          <w:bCs w:val="0"/>
           <w:sz w:val="24"/>
           <w:szCs w:val="24"/>
           <w:lang w:val="en-NZ"/>
@@ -12148,7 +12538,6 @@
         <w:jc w:val="both"/>
       </w:pPr>
       <w:r>
-        <w:lastRenderedPageBreak/>
         <w:t xml:space="preserve">Whitireia and </w:t>
       </w:r>
       <w:proofErr w:type="spellStart"/>
@@ -12266,6 +12655,7 @@
         <w:jc w:val="both"/>
       </w:pPr>
       <w:r>
+        <w:lastRenderedPageBreak/>
         <w:t xml:space="preserve">The Organisation agrees to allow the </w:t>
       </w:r>
       <w:proofErr w:type="gramStart"/>
@@ -12495,7 +12885,6 @@
       </w:pPr>
       <w:bookmarkStart w:id="35" w:name="_Toc236998704"/>
       <w:r>
-        <w:lastRenderedPageBreak/>
         <w:t>3</w:t>
       </w:r>
       <w:r>
@@ -12561,7 +12950,11 @@
         <w:ind w:left="696" w:hanging="427"/>
       </w:pPr>
       <w:r>
-        <w:t xml:space="preserve">4.1 The parties may wish, from time to time, in connection with the Project undertaken under this Agreement, to disclose certain information of a confidential nature (“Confidential Information”) to each other.  Each party will use reasonable efforts to prevent the disclosure of any of the other parties Confidential Information to third parties for a period of three (3) years from receipt of that information, provided that the recipient party’s obligation shall not apply to information that: </w:t>
+        <w:t xml:space="preserve">4.1 The parties may wish, from time to time, in connection with the Project undertaken under this Agreement, to disclose certain information of a confidential nature (“Confidential Information”) to </w:t>
+      </w:r>
+      <w:r>
+        <w:lastRenderedPageBreak/>
+        <w:t xml:space="preserve">each other.  Each party will use reasonable efforts to prevent the disclosure of any of the other parties Confidential Information to third parties for a period of three (3) years from receipt of that information, provided that the recipient party’s obligation shall not apply to information that: </w:t>
       </w:r>
     </w:p>
     <w:p>
@@ -13007,7 +13400,6 @@
         <w:ind w:left="1135"/>
       </w:pPr>
       <w:r>
-        <w:lastRenderedPageBreak/>
         <w:t xml:space="preserve">The Custom property will be vested solely in the Organisation whereas Generic property will vest solely in each respective Student.  Each Student hereby grants the Organisation and where more than one Student has been involved in the Project, the other Student(s), a perpetual non-exclusive licence for that Generic property. </w:t>
       </w:r>
     </w:p>
@@ -13228,6 +13620,7 @@
               <w:rPr>
                 <w:rFonts w:ascii="Times New Roman" w:hAnsi="Times New Roman" w:cs="Times New Roman"/>
               </w:rPr>
+              <w:lastRenderedPageBreak/>
               <w:t>Project Client</w:t>
             </w:r>
           </w:p>

</xml_diff>